<commit_message>
docs(manuals): remove the role change, retake the users screenshot and replace the hand drawn figures (4.3, 4.4)
</commit_message>
<xml_diff>
--- a/09_MANUALES/EN/WORD/09_Installation_Manual.docx
+++ b/09_MANUALES/EN/WORD/09_Installation_Manual.docx
@@ -32,7 +32,7 @@
         <w:pStyle w:val="BodyText"/>
       </w:pPr>
       <w:r>
-        <w:t xml:space="preserve">Brayan Estiven Patiño Cabrera (Project Leader), Juan Camilo Guilombo Osorio (Frontend Leader), and Merari Urbano (Backend Leader)</w:t>
+        <w:t xml:space="preserve">Brayan Estiven Patiño Cabrera (Project Leader), Juan Camilo Guilombo Osorio (Frontend Leader), and Merari Urbano Quintero (Backend Leader)</w:t>
       </w:r>
     </w:p>
     <w:p>
@@ -64,7 +64,7 @@
         <w:pStyle w:val="BodyText"/>
       </w:pPr>
       <w:r>
-        <w:t xml:space="preserve">October 17, 2026</w:t>
+        <w:t xml:space="preserve">October 20, 2026</w:t>
       </w:r>
     </w:p>
     <w:p>
@@ -72,7 +72,7 @@
         <w:pStyle w:val="BodyText"/>
       </w:pPr>
       <w:r>
-        <w:t xml:space="preserve">Manual Type: Installation Manual (Infrastructure and DevOps Staff) · Version 4.1</w:t>
+        <w:t xml:space="preserve">Manual Type: Installation Manual (Infrastructure and DevOps Staff) · Version 4.3</w:t>
       </w:r>
     </w:p>
     <w:bookmarkStart w:id="20" w:name="version-control"/>
@@ -531,6 +531,68 @@
             </w:pPr>
             <w:r>
               <w:t xml:space="preserve">Continuous integration with GitHub Actions: the scope was updated and it was removed from Annex B.</w:t>
+            </w:r>
+          </w:p>
+        </w:tc>
+        <w:tc>
+          <w:tcPr/>
+          <w:p>
+            <w:pPr>
+              <w:pStyle w:val="Compact"/>
+            </w:pPr>
+            <w:r>
+              <w:t xml:space="preserve">Development team</w:t>
+            </w:r>
+          </w:p>
+        </w:tc>
+      </w:tr>
+      <w:tr>
+        <w:tc>
+          <w:tcPr/>
+          <w:p>
+            <w:pPr>
+              <w:pStyle w:val="Compact"/>
+            </w:pPr>
+            <w:r>
+              <w:t xml:space="preserve">4.3</w:t>
+            </w:r>
+          </w:p>
+        </w:tc>
+        <w:tc>
+          <w:tcPr/>
+          <w:p>
+            <w:pPr>
+              <w:pStyle w:val="Compact"/>
+            </w:pPr>
+            <w:r>
+              <w:t xml:space="preserve">2026-10-20</w:t>
+            </w:r>
+          </w:p>
+        </w:tc>
+        <w:tc>
+          <w:tcPr/>
+          <w:p>
+            <w:pPr>
+              <w:pStyle w:val="Compact"/>
+            </w:pPr>
+            <w:r>
+              <w:t xml:space="preserve">Review against the code of October 20, 2026: the</w:t>
+            </w:r>
+            <w:r>
+              <w:t xml:space="preserve"> </w:t>
+            </w:r>
+            <w:r>
+              <w:rPr>
+                <w:i/>
+                <w:iCs/>
+              </w:rPr>
+              <w:t xml:space="preserve">notification.notification_type</w:t>
+            </w:r>
+            <w:r>
+              <w:t xml:space="preserve"> </w:t>
+            </w:r>
+            <w:r>
+              <w:t xml:space="preserve">catalog has 24 rows (migrations 031 and 038 added the alert for a booking without an operator and the new app version notice).</w:t>
             </w:r>
           </w:p>
         </w:tc>
@@ -10703,7 +10765,7 @@
               <w:pStyle w:val="Compact"/>
             </w:pPr>
             <w:r>
-              <w:t xml:space="preserve">22 rows.</w:t>
+              <w:t xml:space="preserve">24 rows.</w:t>
             </w:r>
           </w:p>
         </w:tc>

</xml_diff>

<commit_message>
docs(manuals): add the follow-up variables and migrations 040 and 041 to the English installation manual (4.5)
</commit_message>
<xml_diff>
--- a/09_MANUALES/EN/WORD/09_Installation_Manual.docx
+++ b/09_MANUALES/EN/WORD/09_Installation_Manual.docx
@@ -64,7 +64,7 @@
         <w:pStyle w:val="BodyText"/>
       </w:pPr>
       <w:r>
-        <w:t xml:space="preserve">October 20, 2026</w:t>
+        <w:t xml:space="preserve">October 21, 2026</w:t>
       </w:r>
     </w:p>
     <w:p>
@@ -72,7 +72,7 @@
         <w:pStyle w:val="BodyText"/>
       </w:pPr>
       <w:r>
-        <w:t xml:space="preserve">Manual Type: Installation Manual (Infrastructure and DevOps Staff) · Version 4.3</w:t>
+        <w:t xml:space="preserve">Manual Type: Installation Manual (Infrastructure and DevOps Staff) · Version 4.5</w:t>
       </w:r>
     </w:p>
     <w:bookmarkStart w:id="20" w:name="version-control"/>
@@ -608,6 +608,162 @@
           </w:p>
         </w:tc>
       </w:tr>
+      <w:tr>
+        <w:tc>
+          <w:tcPr/>
+          <w:p>
+            <w:pPr>
+              <w:pStyle w:val="Compact"/>
+            </w:pPr>
+            <w:r>
+              <w:t xml:space="preserve">4.4</w:t>
+            </w:r>
+          </w:p>
+        </w:tc>
+        <w:tc>
+          <w:tcPr/>
+          <w:p>
+            <w:pPr>
+              <w:pStyle w:val="Compact"/>
+            </w:pPr>
+            <w:r>
+              <w:t xml:space="preserve">2026-10-21</w:t>
+            </w:r>
+          </w:p>
+        </w:tc>
+        <w:tc>
+          <w:tcPr/>
+          <w:p>
+            <w:pPr>
+              <w:pStyle w:val="Compact"/>
+            </w:pPr>
+            <w:r>
+              <w:t xml:space="preserve">Review against the code of October 21, 2026: optional variables of the gateway session check and of the close of expired bookings (section 10.2), booking-service seeds 110 to 112 (section 11.2), cancellation reasons (Table 9), automatic backups of the public server (section 11.6), check of the token of a closed session (sections 16.3 and 16.4), and new errors (Table 14).</w:t>
+            </w:r>
+          </w:p>
+        </w:tc>
+        <w:tc>
+          <w:tcPr/>
+          <w:p>
+            <w:pPr>
+              <w:pStyle w:val="Compact"/>
+            </w:pPr>
+            <w:r>
+              <w:t xml:space="preserve">Development team</w:t>
+            </w:r>
+          </w:p>
+        </w:tc>
+      </w:tr>
+      <w:tr>
+        <w:tc>
+          <w:tcPr/>
+          <w:p>
+            <w:pPr>
+              <w:pStyle w:val="Compact"/>
+            </w:pPr>
+            <w:r>
+              <w:t xml:space="preserve">4.5</w:t>
+            </w:r>
+          </w:p>
+        </w:tc>
+        <w:tc>
+          <w:tcPr/>
+          <w:p>
+            <w:pPr>
+              <w:pStyle w:val="Compact"/>
+            </w:pPr>
+            <w:r>
+              <w:t xml:space="preserve">2026-10-21</w:t>
+            </w:r>
+          </w:p>
+        </w:tc>
+        <w:tc>
+          <w:tcPr/>
+          <w:p>
+            <w:pPr>
+              <w:pStyle w:val="Compact"/>
+            </w:pPr>
+            <w:r>
+              <w:t xml:space="preserve">Change of the rule for bookings that end without being closed, reviewed by the team on the night of October 21: booking-service only cancels expired scheduled bookings and operations-service reviews the confirmed and started ones. Added the</w:t>
+            </w:r>
+            <w:r>
+              <w:t xml:space="preserve"> </w:t>
+            </w:r>
+            <w:r>
+              <w:rPr>
+                <w:i/>
+                <w:iCs/>
+              </w:rPr>
+              <w:t xml:space="preserve">FOLLOW_UP_ENABLED</w:t>
+            </w:r>
+            <w:r>
+              <w:t xml:space="preserve"> </w:t>
+            </w:r>
+            <w:r>
+              <w:t xml:space="preserve">and</w:t>
+            </w:r>
+            <w:r>
+              <w:t xml:space="preserve"> </w:t>
+            </w:r>
+            <w:r>
+              <w:rPr>
+                <w:i/>
+                <w:iCs/>
+              </w:rPr>
+              <w:t xml:space="preserve">FOLLOW_UP_INTERVAL</w:t>
+            </w:r>
+            <w:r>
+              <w:t xml:space="preserve"> </w:t>
+            </w:r>
+            <w:r>
+              <w:t xml:space="preserve">variables,</w:t>
+            </w:r>
+            <w:r>
+              <w:t xml:space="preserve"> </w:t>
+            </w:r>
+            <w:r>
+              <w:rPr>
+                <w:i/>
+                <w:iCs/>
+              </w:rPr>
+              <w:t xml:space="preserve">BOOKING_EXPIRY_GRACE_MINUTES</w:t>
+            </w:r>
+            <w:r>
+              <w:t xml:space="preserve"> </w:t>
+            </w:r>
+            <w:r>
+              <w:t xml:space="preserve">shared by booking-service and operations-service, and the services that use</w:t>
+            </w:r>
+            <w:r>
+              <w:t xml:space="preserve"> </w:t>
+            </w:r>
+            <w:r>
+              <w:rPr>
+                <w:i/>
+                <w:iCs/>
+              </w:rPr>
+              <w:t xml:space="preserve">INTERNAL_API_KEY</w:t>
+            </w:r>
+            <w:r>
+              <w:t xml:space="preserve"> </w:t>
+            </w:r>
+            <w:r>
+              <w:t xml:space="preserve">(section 10.2); changelogs 040 of operations-service and 041 of notification-service (section 11.2); 26 notification types (Table 9); check of the "To close" card (section 16.4); a new error (Table 14) and Annex B.</w:t>
+            </w:r>
+          </w:p>
+        </w:tc>
+        <w:tc>
+          <w:tcPr/>
+          <w:p>
+            <w:pPr>
+              <w:pStyle w:val="Compact"/>
+            </w:pPr>
+            <w:r>
+              <w:t xml:space="preserve">Development team</w:t>
+            </w:r>
+          </w:p>
+        </w:tc>
+      </w:tr>
     </w:tbl>
     <w:p>
       <w:pPr>
@@ -1910,7 +2066,7 @@
         <w:t xml:space="preserve"> </w:t>
       </w:r>
       <w:r>
-        <w:t xml:space="preserve">branch as of October 17, 2026), and the project documentation updated on that same date (Vehicle Washing Development Team, 2026a, 2026b). The values that depend on each installation (passwords, keys, and addresses) are written between angle brackets, such as</w:t>
+        <w:t xml:space="preserve">branch as of October 21, 2026), and the project documentation updated on that same date (Vehicle Washing Development Team, 2026a, 2026b). The values that depend on each installation (passwords, keys, and addresses) are written between angle brackets, such as</w:t>
       </w:r>
       <w:r>
         <w:t xml:space="preserve"> </w:t>
@@ -6976,18 +7132,18 @@
               <w:pStyle w:val="Compact"/>
             </w:pPr>
             <w:r>
-              <w:t xml:space="preserve">security-service and notification-service</w:t>
-            </w:r>
-          </w:p>
-        </w:tc>
-        <w:tc>
-          <w:tcPr/>
-          <w:p>
-            <w:pPr>
-              <w:pStyle w:val="Compact"/>
-            </w:pPr>
-            <w:r>
-              <w:t xml:space="preserve">Key of the internal routes; without it, booking, payment, and coupon notices and reminders are not sent by email, and the notification switches of each user cannot be read.</w:t>
+              <w:t xml:space="preserve">security-service, booking-service, operations-service, and notification-service</w:t>
+            </w:r>
+          </w:p>
+        </w:tc>
+        <w:tc>
+          <w:tcPr/>
+          <w:p>
+            <w:pPr>
+              <w:pStyle w:val="Compact"/>
+            </w:pPr>
+            <w:r>
+              <w:t xml:space="preserve">Key of the internal routes; without it, booking, payment, and coupon notices and reminders are not sent by email, the notification switches of each user cannot be read, and operations-service cannot close as No-show the confirmed bookings that ended without an operator.</w:t>
             </w:r>
           </w:p>
         </w:tc>
@@ -7074,6 +7230,310 @@
             </w:pPr>
             <w:r>
               <w:t xml:space="preserve">America/Bogota, 30, and 60 by default.</w:t>
+            </w:r>
+          </w:p>
+        </w:tc>
+      </w:tr>
+      <w:tr>
+        <w:tc>
+          <w:tcPr/>
+          <w:p>
+            <w:pPr>
+              <w:pStyle w:val="Compact"/>
+            </w:pPr>
+            <w:r>
+              <w:t xml:space="preserve">SESSION_CHECK_ENABLED, SESSION_CHECK_CACHE_TTL, SESSION_CHECK_TIMEOUT</w:t>
+            </w:r>
+          </w:p>
+        </w:tc>
+        <w:tc>
+          <w:tcPr/>
+          <w:p>
+            <w:pPr>
+              <w:pStyle w:val="Compact"/>
+            </w:pPr>
+            <w:r>
+              <w:t xml:space="preserve">api-gateway</w:t>
+            </w:r>
+          </w:p>
+        </w:tc>
+        <w:tc>
+          <w:tcPr/>
+          <w:p>
+            <w:pPr>
+              <w:pStyle w:val="Compact"/>
+            </w:pPr>
+            <w:r>
+              <w:t xml:space="preserve">Check of the token session (since October 21, 2026):</w:t>
+            </w:r>
+            <w:r>
+              <w:t xml:space="preserve"> </w:t>
+            </w:r>
+            <w:r>
+              <w:rPr>
+                <w:i/>
+                <w:iCs/>
+              </w:rPr>
+              <w:t xml:space="preserve">true</w:t>
+            </w:r>
+            <w:r>
+              <w:t xml:space="preserve">,</w:t>
+            </w:r>
+            <w:r>
+              <w:t xml:space="preserve"> </w:t>
+            </w:r>
+            <w:r>
+              <w:rPr>
+                <w:i/>
+                <w:iCs/>
+              </w:rPr>
+              <w:t xml:space="preserve">30s</w:t>
+            </w:r>
+            <w:r>
+              <w:t xml:space="preserve">, and</w:t>
+            </w:r>
+            <w:r>
+              <w:t xml:space="preserve"> </w:t>
+            </w:r>
+            <w:r>
+              <w:rPr>
+                <w:i/>
+                <w:iCs/>
+              </w:rPr>
+              <w:t xml:space="preserve">3s</w:t>
+            </w:r>
+            <w:r>
+              <w:t xml:space="preserve"> </w:t>
+            </w:r>
+            <w:r>
+              <w:t xml:space="preserve">by default. They are not in</w:t>
+            </w:r>
+            <w:r>
+              <w:t xml:space="preserve"> </w:t>
+            </w:r>
+            <w:r>
+              <w:rPr>
+                <w:i/>
+                <w:iCs/>
+              </w:rPr>
+              <w:t xml:space="preserve">.env.example</w:t>
+            </w:r>
+            <w:r>
+              <w:t xml:space="preserve"> </w:t>
+            </w:r>
+            <w:r>
+              <w:t xml:space="preserve">or in the Compose file: in Docker they keep their defaults and only change if the gateway runs from the IDE (action ACO-14).</w:t>
+            </w:r>
+          </w:p>
+        </w:tc>
+      </w:tr>
+      <w:tr>
+        <w:tc>
+          <w:tcPr/>
+          <w:p>
+            <w:pPr>
+              <w:pStyle w:val="Compact"/>
+            </w:pPr>
+            <w:r>
+              <w:t xml:space="preserve">BOOKING_EXPIRY_CHECK_ENABLED, BOOKING_EXPIRY_CHECK_INTERVAL</w:t>
+            </w:r>
+          </w:p>
+        </w:tc>
+        <w:tc>
+          <w:tcPr/>
+          <w:p>
+            <w:pPr>
+              <w:pStyle w:val="Compact"/>
+            </w:pPr>
+            <w:r>
+              <w:t xml:space="preserve">booking-service</w:t>
+            </w:r>
+          </w:p>
+        </w:tc>
+        <w:tc>
+          <w:tcPr/>
+          <w:p>
+            <w:pPr>
+              <w:pStyle w:val="Compact"/>
+            </w:pPr>
+            <w:r>
+              <w:t xml:space="preserve">Automatic cancellation of the scheduled bookings that were never confirmed (reason</w:t>
+            </w:r>
+            <w:r>
+              <w:t xml:space="preserve"> </w:t>
+            </w:r>
+            <w:r>
+              <w:rPr>
+                <w:i/>
+                <w:iCs/>
+              </w:rPr>
+              <w:t xml:space="preserve">EXPIRED</w:t>
+            </w:r>
+            <w:r>
+              <w:t xml:space="preserve">):</w:t>
+            </w:r>
+            <w:r>
+              <w:t xml:space="preserve"> </w:t>
+            </w:r>
+            <w:r>
+              <w:rPr>
+                <w:i/>
+                <w:iCs/>
+              </w:rPr>
+              <w:t xml:space="preserve">true</w:t>
+            </w:r>
+            <w:r>
+              <w:t xml:space="preserve"> </w:t>
+            </w:r>
+            <w:r>
+              <w:t xml:space="preserve">and</w:t>
+            </w:r>
+            <w:r>
+              <w:t xml:space="preserve"> </w:t>
+            </w:r>
+            <w:r>
+              <w:rPr>
+                <w:i/>
+                <w:iCs/>
+              </w:rPr>
+              <w:t xml:space="preserve">PT5M</w:t>
+            </w:r>
+            <w:r>
+              <w:t xml:space="preserve"> </w:t>
+            </w:r>
+            <w:r>
+              <w:t xml:space="preserve">(every 5 minutes) by default. Like the previous ones, they do not go through the Compose file.</w:t>
+            </w:r>
+          </w:p>
+        </w:tc>
+      </w:tr>
+      <w:tr>
+        <w:tc>
+          <w:tcPr/>
+          <w:p>
+            <w:pPr>
+              <w:pStyle w:val="Compact"/>
+            </w:pPr>
+            <w:r>
+              <w:t xml:space="preserve">BOOKING_EXPIRY_GRACE_MINUTES</w:t>
+            </w:r>
+          </w:p>
+        </w:tc>
+        <w:tc>
+          <w:tcPr/>
+          <w:p>
+            <w:pPr>
+              <w:pStyle w:val="Compact"/>
+            </w:pPr>
+            <w:r>
+              <w:t xml:space="preserve">booking-service and operations-service</w:t>
+            </w:r>
+          </w:p>
+        </w:tc>
+        <w:tc>
+          <w:tcPr/>
+          <w:p>
+            <w:pPr>
+              <w:pStyle w:val="Compact"/>
+            </w:pPr>
+            <w:r>
+              <w:t xml:space="preserve">Minutes after the end time before an expired booking is closed;</w:t>
+            </w:r>
+            <w:r>
+              <w:t xml:space="preserve"> </w:t>
+            </w:r>
+            <w:r>
+              <w:rPr>
+                <w:i/>
+                <w:iCs/>
+              </w:rPr>
+              <w:t xml:space="preserve">60</w:t>
+            </w:r>
+            <w:r>
+              <w:t xml:space="preserve"> </w:t>
+            </w:r>
+            <w:r>
+              <w:t xml:space="preserve">by default. Both services use it, so if it is changed it must have the same value in both. It does not go through the Compose file.</w:t>
+            </w:r>
+          </w:p>
+        </w:tc>
+      </w:tr>
+      <w:tr>
+        <w:tc>
+          <w:tcPr/>
+          <w:p>
+            <w:pPr>
+              <w:pStyle w:val="Compact"/>
+            </w:pPr>
+            <w:r>
+              <w:t xml:space="preserve">FOLLOW_UP_ENABLED, FOLLOW_UP_INTERVAL</w:t>
+            </w:r>
+          </w:p>
+        </w:tc>
+        <w:tc>
+          <w:tcPr/>
+          <w:p>
+            <w:pPr>
+              <w:pStyle w:val="Compact"/>
+            </w:pPr>
+            <w:r>
+              <w:t xml:space="preserve">operations-service</w:t>
+            </w:r>
+          </w:p>
+        </w:tc>
+        <w:tc>
+          <w:tcPr/>
+          <w:p>
+            <w:pPr>
+              <w:pStyle w:val="Compact"/>
+            </w:pPr>
+            <w:r>
+              <w:t xml:space="preserve">Review of the bookings that ended without being closed (since the night of October 21, 2026): a confirmed booking that never had an operator becomes No-show, and one that had an operator and nobody recorded stays in "To close".</w:t>
+            </w:r>
+            <w:r>
+              <w:t xml:space="preserve"> </w:t>
+            </w:r>
+            <w:r>
+              <w:rPr>
+                <w:i/>
+                <w:iCs/>
+              </w:rPr>
+              <w:t xml:space="preserve">true</w:t>
+            </w:r>
+            <w:r>
+              <w:t xml:space="preserve"> </w:t>
+            </w:r>
+            <w:r>
+              <w:t xml:space="preserve">and</w:t>
+            </w:r>
+            <w:r>
+              <w:t xml:space="preserve"> </w:t>
+            </w:r>
+            <w:r>
+              <w:rPr>
+                <w:i/>
+                <w:iCs/>
+              </w:rPr>
+              <w:t xml:space="preserve">PT5M</w:t>
+            </w:r>
+            <w:r>
+              <w:t xml:space="preserve"> </w:t>
+            </w:r>
+            <w:r>
+              <w:t xml:space="preserve">by default; needs</w:t>
+            </w:r>
+            <w:r>
+              <w:t xml:space="preserve"> </w:t>
+            </w:r>
+            <w:r>
+              <w:rPr>
+                <w:i/>
+                <w:iCs/>
+              </w:rPr>
+              <w:t xml:space="preserve">INTERNAL_API_KEY</w:t>
+            </w:r>
+            <w:r>
+              <w:t xml:space="preserve">. They do not go through the Compose file.</w:t>
             </w:r>
           </w:p>
         </w:tc>
@@ -8745,7 +9205,7 @@
         <w:t xml:space="preserve"> </w:t>
       </w:r>
       <w:r>
-        <w:t xml:space="preserve">are created the first time each service starts (section 12). Table 8 shows the changelogs of the version of October 16, 2026.</w:t>
+        <w:t xml:space="preserve">are created the first time each service starts (section 12). Table 8 shows the changelogs of the version of October 21, 2026.</w:t>
       </w:r>
     </w:p>
     <w:p>
@@ -8910,7 +9370,23 @@
               <w:pStyle w:val="Compact"/>
             </w:pPr>
             <w:r>
-              <w:t xml:space="preserve">005 catalog and booking schemas, 018 changes of ADR-010, 021 schedule history, 022 loyalty points of the catalog, 024 removal of the bay operator, 032 business data of the establishment; seeds 103 catalog, 104 statuses and reasons, 109 establishment, schedule, and four bays.</w:t>
+              <w:t xml:space="preserve">005 catalog and booking schemas, 018 changes of ADR-010, 021 schedule history, 022 loyalty points of the catalog, 024 removal of the bay operator, 032 business data of the establishment; seeds 103 catalog, 104 statuses and reasons, 109 establishment, schedule, and four bays, 110 business data, 111 removal of the example business data so the real business fills it in, and 112</w:t>
+            </w:r>
+            <w:r>
+              <w:t xml:space="preserve"> </w:t>
+            </w:r>
+            <w:r>
+              <w:rPr>
+                <w:i/>
+                <w:iCs/>
+              </w:rPr>
+              <w:t xml:space="preserve">EXPIRED</w:t>
+            </w:r>
+            <w:r>
+              <w:t xml:space="preserve"> </w:t>
+            </w:r>
+            <w:r>
+              <w:t xml:space="preserve">reason of the automatic close of expired bookings.</w:t>
             </w:r>
           </w:p>
         </w:tc>
@@ -8945,7 +9421,17 @@
               <w:pStyle w:val="Compact"/>
             </w:pPr>
             <w:r>
-              <w:t xml:space="preserve">007 execution schema, 033 inspection reports with phases, findings, and photos, 037 operator profile; seed 105 execution statuses.</w:t>
+              <w:t xml:space="preserve">007 execution schema, 033 inspection reports with phases, findings, and photos, 037 operator profile, 040 time of the service-not-recorded notice (</w:t>
+            </w:r>
+            <w:r>
+              <w:rPr>
+                <w:i/>
+                <w:iCs/>
+              </w:rPr>
+              <w:t xml:space="preserve">follow_up_notice_at</w:t>
+            </w:r>
+            <w:r>
+              <w:t xml:space="preserve">); seed 105 execution statuses.</w:t>
             </w:r>
           </w:p>
         </w:tc>
@@ -8980,7 +9466,7 @@
               <w:pStyle w:val="Compact"/>
             </w:pPr>
             <w:r>
-              <w:t xml:space="preserve">010 notification schema, 016 device tokens, 017 processed events, 019 booking reminders, 025 promotion redeemed type, 027 staff notifications and booking tracking, 028 payment refunded type, 029 loyalty and inspection types, 031 unassigned booking alert, 038 new app version notice type; seed 108 notification types.</w:t>
+              <w:t xml:space="preserve">010 notification schema, 016 device tokens, 017 processed events, 019 booking reminders, 025 promotion redeemed type, 027 staff notifications and booking tracking, 028 payment refunded type, 029 loyalty and inspection types, 031 unassigned booking alert, 038 new app version notice type, 041 service-not-recorded notice types for the operator and the administrator; seed 108 notification types.</w:t>
             </w:r>
           </w:p>
         </w:tc>
@@ -10634,18 +11120,34 @@
               <w:pStyle w:val="Compact"/>
             </w:pPr>
             <w:r>
-              <w:t xml:space="preserve">booking.service_bay</w:t>
-            </w:r>
-          </w:p>
-        </w:tc>
-        <w:tc>
-          <w:tcPr/>
-          <w:p>
-            <w:pPr>
-              <w:pStyle w:val="Compact"/>
-            </w:pPr>
-            <w:r>
-              <w:t xml:space="preserve">4 bays.</w:t>
+              <w:t xml:space="preserve">booking.cancellation_reason</w:t>
+            </w:r>
+          </w:p>
+        </w:tc>
+        <w:tc>
+          <w:tcPr/>
+          <w:p>
+            <w:pPr>
+              <w:pStyle w:val="Compact"/>
+            </w:pPr>
+            <w:r>
+              <w:t xml:space="preserve">7 rows;</w:t>
+            </w:r>
+            <w:r>
+              <w:t xml:space="preserve"> </w:t>
+            </w:r>
+            <w:r>
+              <w:rPr>
+                <w:i/>
+                <w:iCs/>
+              </w:rPr>
+              <w:t xml:space="preserve">EXPIRED</w:t>
+            </w:r>
+            <w:r>
+              <w:t xml:space="preserve"> </w:t>
+            </w:r>
+            <w:r>
+              <w:t xml:space="preserve">(seed 112) is only used by the system and does not appear in the list of reasons.</w:t>
             </w:r>
           </w:p>
         </w:tc>
@@ -10658,18 +11160,18 @@
               <w:pStyle w:val="Compact"/>
             </w:pPr>
             <w:r>
-              <w:t xml:space="preserve">execution.execution_status</w:t>
-            </w:r>
-          </w:p>
-        </w:tc>
-        <w:tc>
-          <w:tcPr/>
-          <w:p>
-            <w:pPr>
-              <w:pStyle w:val="Compact"/>
-            </w:pPr>
-            <w:r>
-              <w:t xml:space="preserve">5 rows: PENDING, IN_PROGRESS, PAUSED, COMPLETED, and WITH_ISSUE.</w:t>
+              <w:t xml:space="preserve">booking.service_bay</w:t>
+            </w:r>
+          </w:p>
+        </w:tc>
+        <w:tc>
+          <w:tcPr/>
+          <w:p>
+            <w:pPr>
+              <w:pStyle w:val="Compact"/>
+            </w:pPr>
+            <w:r>
+              <w:t xml:space="preserve">4 bays.</w:t>
             </w:r>
           </w:p>
         </w:tc>
@@ -10682,18 +11184,18 @@
               <w:pStyle w:val="Compact"/>
             </w:pPr>
             <w:r>
-              <w:t xml:space="preserve">payment.payment_status</w:t>
-            </w:r>
-          </w:p>
-        </w:tc>
-        <w:tc>
-          <w:tcPr/>
-          <w:p>
-            <w:pPr>
-              <w:pStyle w:val="Compact"/>
-            </w:pPr>
-            <w:r>
-              <w:t xml:space="preserve">5 rows; identifier 3 corresponds to APPROVED.</w:t>
+              <w:t xml:space="preserve">execution.execution_status</w:t>
+            </w:r>
+          </w:p>
+        </w:tc>
+        <w:tc>
+          <w:tcPr/>
+          <w:p>
+            <w:pPr>
+              <w:pStyle w:val="Compact"/>
+            </w:pPr>
+            <w:r>
+              <w:t xml:space="preserve">5 rows: PENDING, IN_PROGRESS, PAUSED, COMPLETED, and WITH_ISSUE.</w:t>
             </w:r>
           </w:p>
         </w:tc>
@@ -10706,18 +11208,18 @@
               <w:pStyle w:val="Compact"/>
             </w:pPr>
             <w:r>
-              <w:t xml:space="preserve">payment.payment_method_type</w:t>
-            </w:r>
-          </w:p>
-        </w:tc>
-        <w:tc>
-          <w:tcPr/>
-          <w:p>
-            <w:pPr>
-              <w:pStyle w:val="Compact"/>
-            </w:pPr>
-            <w:r>
-              <w:t xml:space="preserve">4 rows: EFECTIVO, NEQUI, DAVIPLATA, and TRANSFERENCIA.</w:t>
+              <w:t xml:space="preserve">payment.payment_status</w:t>
+            </w:r>
+          </w:p>
+        </w:tc>
+        <w:tc>
+          <w:tcPr/>
+          <w:p>
+            <w:pPr>
+              <w:pStyle w:val="Compact"/>
+            </w:pPr>
+            <w:r>
+              <w:t xml:space="preserve">5 rows; identifier 3 corresponds to APPROVED.</w:t>
             </w:r>
           </w:p>
         </w:tc>
@@ -10730,18 +11232,18 @@
               <w:pStyle w:val="Compact"/>
             </w:pPr>
             <w:r>
-              <w:t xml:space="preserve">payment.loyalty_movement_type</w:t>
-            </w:r>
-          </w:p>
-        </w:tc>
-        <w:tc>
-          <w:tcPr/>
-          <w:p>
-            <w:pPr>
-              <w:pStyle w:val="Compact"/>
-            </w:pPr>
-            <w:r>
-              <w:t xml:space="preserve">5 rows: EARNED, REDEEMED, EXPIRED, ADJUSTED, and REVERSED.</w:t>
+              <w:t xml:space="preserve">payment.payment_method_type</w:t>
+            </w:r>
+          </w:p>
+        </w:tc>
+        <w:tc>
+          <w:tcPr/>
+          <w:p>
+            <w:pPr>
+              <w:pStyle w:val="Compact"/>
+            </w:pPr>
+            <w:r>
+              <w:t xml:space="preserve">4 rows: EFECTIVO, NEQUI, DAVIPLATA, and TRANSFERENCIA.</w:t>
             </w:r>
           </w:p>
         </w:tc>
@@ -10754,18 +11256,18 @@
               <w:pStyle w:val="Compact"/>
             </w:pPr>
             <w:r>
-              <w:t xml:space="preserve">notification.notification_type</w:t>
-            </w:r>
-          </w:p>
-        </w:tc>
-        <w:tc>
-          <w:tcPr/>
-          <w:p>
-            <w:pPr>
-              <w:pStyle w:val="Compact"/>
-            </w:pPr>
-            <w:r>
-              <w:t xml:space="preserve">24 rows.</w:t>
+              <w:t xml:space="preserve">payment.loyalty_movement_type</w:t>
+            </w:r>
+          </w:p>
+        </w:tc>
+        <w:tc>
+          <w:tcPr/>
+          <w:p>
+            <w:pPr>
+              <w:pStyle w:val="Compact"/>
+            </w:pPr>
+            <w:r>
+              <w:t xml:space="preserve">5 rows: EARNED, REDEEMED, EXPIRED, ADJUSTED, and REVERSED.</w:t>
             </w:r>
           </w:p>
         </w:tc>
@@ -10778,6 +11280,30 @@
               <w:pStyle w:val="Compact"/>
             </w:pPr>
             <w:r>
+              <w:t xml:space="preserve">notification.notification_type</w:t>
+            </w:r>
+          </w:p>
+        </w:tc>
+        <w:tc>
+          <w:tcPr/>
+          <w:p>
+            <w:pPr>
+              <w:pStyle w:val="Compact"/>
+            </w:pPr>
+            <w:r>
+              <w:t xml:space="preserve">26 rows.</w:t>
+            </w:r>
+          </w:p>
+        </w:tc>
+      </w:tr>
+      <w:tr>
+        <w:tc>
+          <w:tcPr/>
+          <w:p>
+            <w:pPr>
+              <w:pStyle w:val="Compact"/>
+            </w:pPr>
+            <w:r>
               <w:t xml:space="preserve">security.permission</w:t>
             </w:r>
           </w:p>
@@ -10971,6 +11497,62 @@
     <w:p>
       <w:pPr>
         <w:pStyle w:val="FirstParagraph"/>
+      </w:pPr>
+      <w:r>
+        <w:t xml:space="preserve">On the public server backups are automatic:</w:t>
+      </w:r>
+      <w:r>
+        <w:t xml:space="preserve"> </w:t>
+      </w:r>
+      <w:r>
+        <w:rPr>
+          <w:i/>
+          <w:iCs/>
+        </w:rPr>
+        <w:t xml:space="preserve">deploy/backup-db.sh</w:t>
+      </w:r>
+      <w:r>
+        <w:t xml:space="preserve"> </w:t>
+      </w:r>
+      <w:r>
+        <w:t xml:space="preserve">backs up the database every day and before every update,</w:t>
+      </w:r>
+      <w:r>
+        <w:t xml:space="preserve"> </w:t>
+      </w:r>
+      <w:r>
+        <w:rPr>
+          <w:i/>
+          <w:iCs/>
+        </w:rPr>
+        <w:t xml:space="preserve">deploy/verify-backup.sh</w:t>
+      </w:r>
+      <w:r>
+        <w:t xml:space="preserve"> </w:t>
+      </w:r>
+      <w:r>
+        <w:t xml:space="preserve">checks each backup by restoring it under another name, and</w:t>
+      </w:r>
+      <w:r>
+        <w:t xml:space="preserve"> </w:t>
+      </w:r>
+      <w:r>
+        <w:rPr>
+          <w:i/>
+          <w:iCs/>
+        </w:rPr>
+        <w:t xml:space="preserve">deploy/restore-db.sh</w:t>
+      </w:r>
+      <w:r>
+        <w:t xml:space="preserve"> </w:t>
+      </w:r>
+      <w:r>
+        <w:t xml:space="preserve">restores one (Deployment Document, section 3.2).</w:t>
+      </w:r>
+    </w:p>
+    <w:p>
+      <w:pPr>
+        <w:pStyle w:val="BodyText"/>
       </w:pPr>
       <w:r>
         <w:t xml:space="preserve">To reset a disposable local environment, stop the containers and delete the volumes.</w:t>
@@ -12786,7 +13368,7 @@
         <w:t xml:space="preserve">app.json</w:t>
       </w:r>
       <w:r>
-        <w:t xml:space="preserve">.</w:t>
+        <w:t xml:space="preserve">. The changes of October 21, 2026 (compressed receipt, QR magnifier, and mandatory APK update screen) add no native dependencies.</w:t>
       </w:r>
     </w:p>
     <w:p>
@@ -15278,7 +15860,39 @@
         <w:t xml:space="preserve">401</w:t>
       </w:r>
       <w:r>
-        <w:t xml:space="preserve">. The gateway does not validate tokens (ADR-006): it forwards the request and the service rejects it. Every service, including payment-service, checks the database in its health endpoint: if SQL Server does not answer, it replies</w:t>
+        <w:t xml:space="preserve">. The gateway does not check the token signature (ADR-006): a request without a token goes straight through and booking-service rejects it. Since October 21, 2026 the gateway does cut the token of a closed session: after signing out, repeating the call with the same token (</w:t>
+      </w:r>
+      <w:r>
+        <w:rPr>
+          <w:i/>
+          <w:iCs/>
+        </w:rPr>
+        <w:t xml:space="preserve">-H "Authorization: Bearer</w:t>
+      </w:r>
+      <w:r>
+        <w:rPr>
+          <w:i/>
+          <w:iCs/>
+        </w:rPr>
+        <w:t xml:space="preserve"> </w:t>
+      </w:r>
+      <w:r>
+        <w:rPr>
+          <w:rStyle w:val="VerbatimChar"/>
+          <w:i/>
+          <w:iCs/>
+        </w:rPr>
+        <w:t xml:space="preserve">&lt;TOKEN&gt;</w:t>
+      </w:r>
+      <w:r>
+        <w:rPr>
+          <w:i/>
+          <w:iCs/>
+        </w:rPr>
+        <w:t xml:space="preserve">"</w:t>
+      </w:r>
+      <w:r>
+        <w:t xml:space="preserve">) returns 401 from the gateway, without reaching the service. Every service, including payment-service, checks the database in its health endpoint: if SQL Server does not answer, it replies</w:t>
       </w:r>
       <w:r>
         <w:t xml:space="preserve"> </w:t>
@@ -15494,6 +16108,62 @@
         </w:numPr>
       </w:pPr>
       <w:r>
+        <w:t xml:space="preserve">Sign out and repeat a call with the same token: the gateway answers 401.</w:t>
+      </w:r>
+    </w:p>
+    <w:p>
+      <w:pPr>
+        <w:pStyle w:val="Compact"/>
+        <w:numPr>
+          <w:ilvl w:val="0"/>
+          <w:numId w:val="1021"/>
+        </w:numPr>
+      </w:pPr>
+      <w:r>
+        <w:t xml:space="preserve">Optional: as administrator, create a test booking for a time that ends soon, with an operator, and do not start it. A few minutes after its end time it must appear in the</w:t>
+      </w:r>
+      <w:r>
+        <w:t xml:space="preserve"> </w:t>
+      </w:r>
+      <w:r>
+        <w:rPr>
+          <w:b/>
+          <w:bCs/>
+        </w:rPr>
+        <w:t xml:space="preserve">To close</w:t>
+      </w:r>
+      <w:r>
+        <w:t xml:space="preserve"> </w:t>
+      </w:r>
+      <w:r>
+        <w:t xml:space="preserve">card of the administrator's home, with the notice "Servicio sin registrar" (service not recorded); clicking</w:t>
+      </w:r>
+      <w:r>
+        <w:t xml:space="preserve"> </w:t>
+      </w:r>
+      <w:r>
+        <w:rPr>
+          <w:b/>
+          <w:bCs/>
+        </w:rPr>
+        <w:t xml:space="preserve">Attended</w:t>
+      </w:r>
+      <w:r>
+        <w:t xml:space="preserve"> </w:t>
+      </w:r>
+      <w:r>
+        <w:t xml:space="preserve">makes it Completed.</w:t>
+      </w:r>
+    </w:p>
+    <w:p>
+      <w:pPr>
+        <w:pStyle w:val="Compact"/>
+        <w:numPr>
+          <w:ilvl w:val="0"/>
+          <w:numId w:val="1021"/>
+        </w:numPr>
+      </w:pPr>
+      <w:r>
         <w:t xml:space="preserve">Restart the containers (</w:t>
       </w:r>
       <w:r>
@@ -16465,29 +17135,29 @@
               <w:pStyle w:val="Compact"/>
             </w:pPr>
             <w:r>
-              <w:t xml:space="preserve">503 CUSTOMER_SERVICE_UNAVAILABLE or BOOKING_SERVICE_UNAVAILABLE</w:t>
-            </w:r>
-          </w:p>
-        </w:tc>
-        <w:tc>
-          <w:tcPr/>
-          <w:p>
-            <w:pPr>
-              <w:pStyle w:val="Compact"/>
-            </w:pPr>
-            <w:r>
-              <w:t xml:space="preserve">The service called is down.</w:t>
-            </w:r>
-          </w:p>
-        </w:tc>
-        <w:tc>
-          <w:tcPr/>
-          <w:p>
-            <w:pPr>
-              <w:pStyle w:val="Compact"/>
-            </w:pPr>
-            <w:r>
-              <w:t xml:space="preserve">Start customer-service or booking-service.</w:t>
+              <w:t xml:space="preserve">401 right after signing out in another tab or device</w:t>
+            </w:r>
+          </w:p>
+        </w:tc>
+        <w:tc>
+          <w:tcPr/>
+          <w:p>
+            <w:pPr>
+              <w:pStyle w:val="Compact"/>
+            </w:pPr>
+            <w:r>
+              <w:t xml:space="preserve">The session was closed and the gateway cuts its token.</w:t>
+            </w:r>
+          </w:p>
+        </w:tc>
+        <w:tc>
+          <w:tcPr/>
+          <w:p>
+            <w:pPr>
+              <w:pStyle w:val="Compact"/>
+            </w:pPr>
+            <w:r>
+              <w:t xml:space="preserve">Log in again.</w:t>
             </w:r>
           </w:p>
         </w:tc>
@@ -16500,29 +17170,39 @@
               <w:pStyle w:val="Compact"/>
             </w:pPr>
             <w:r>
-              <w:t xml:space="preserve">"Your customer profile is not ready yet"</w:t>
-            </w:r>
-          </w:p>
-        </w:tc>
-        <w:tc>
-          <w:tcPr/>
-          <w:p>
-            <w:pPr>
-              <w:pStyle w:val="Compact"/>
-            </w:pPr>
-            <w:r>
-              <w:t xml:space="preserve">The customer profile has not been created (event not consumed).</w:t>
-            </w:r>
-          </w:p>
-        </w:tc>
-        <w:tc>
-          <w:tcPr/>
-          <w:p>
-            <w:pPr>
-              <w:pStyle w:val="Compact"/>
-            </w:pPr>
-            <w:r>
-              <w:t xml:space="preserve">Wait and retry; with MESSAGING_ENABLED=true check the customer-service queue.</w:t>
+              <w:t xml:space="preserve">Requests take about 3 more seconds and the gateway log says</w:t>
+            </w:r>
+            <w:r>
+              <w:t xml:space="preserve"> </w:t>
+            </w:r>
+            <w:r>
+              <w:rPr>
+                <w:i/>
+                <w:iCs/>
+              </w:rPr>
+              <w:t xml:space="preserve">No se pudo confirmar la sesión</w:t>
+            </w:r>
+          </w:p>
+        </w:tc>
+        <w:tc>
+          <w:tcPr/>
+          <w:p>
+            <w:pPr>
+              <w:pStyle w:val="Compact"/>
+            </w:pPr>
+            <w:r>
+              <w:t xml:space="preserve">security-service does not answer; the gateway lets the request through after waiting for it.</w:t>
+            </w:r>
+          </w:p>
+        </w:tc>
+        <w:tc>
+          <w:tcPr/>
+          <w:p>
+            <w:pPr>
+              <w:pStyle w:val="Compact"/>
+            </w:pPr>
+            <w:r>
+              <w:t xml:space="preserve">Start security-service and check its health.</w:t>
             </w:r>
           </w:p>
         </w:tc>
@@ -16535,29 +17215,29 @@
               <w:pStyle w:val="Compact"/>
             </w:pPr>
             <w:r>
-              <w:t xml:space="preserve">Emails do not arrive in Mailpit</w:t>
-            </w:r>
-          </w:p>
-        </w:tc>
-        <w:tc>
-          <w:tcPr/>
-          <w:p>
-            <w:pPr>
-              <w:pStyle w:val="Compact"/>
-            </w:pPr>
-            <w:r>
-              <w:t xml:space="preserve">MAIL_ENABLED=false or wrong host or port.</w:t>
-            </w:r>
-          </w:p>
-        </w:tc>
-        <w:tc>
-          <w:tcPr/>
-          <w:p>
-            <w:pPr>
-              <w:pStyle w:val="Compact"/>
-            </w:pPr>
-            <w:r>
-              <w:t xml:space="preserve">MAIL_HOST=localhost and MAIL_PORT=1025 on the host; MAIL_DOCKER_HOST=mailpit in Docker.</w:t>
+              <w:t xml:space="preserve">503 CUSTOMER_SERVICE_UNAVAILABLE or BOOKING_SERVICE_UNAVAILABLE</w:t>
+            </w:r>
+          </w:p>
+        </w:tc>
+        <w:tc>
+          <w:tcPr/>
+          <w:p>
+            <w:pPr>
+              <w:pStyle w:val="Compact"/>
+            </w:pPr>
+            <w:r>
+              <w:t xml:space="preserve">The service called is down.</w:t>
+            </w:r>
+          </w:p>
+        </w:tc>
+        <w:tc>
+          <w:tcPr/>
+          <w:p>
+            <w:pPr>
+              <w:pStyle w:val="Compact"/>
+            </w:pPr>
+            <w:r>
+              <w:t xml:space="preserve">Start customer-service or booking-service.</w:t>
             </w:r>
           </w:p>
         </w:tc>
@@ -16570,6 +17250,76 @@
               <w:pStyle w:val="Compact"/>
             </w:pPr>
             <w:r>
+              <w:t xml:space="preserve">"Your customer profile is not ready yet"</w:t>
+            </w:r>
+          </w:p>
+        </w:tc>
+        <w:tc>
+          <w:tcPr/>
+          <w:p>
+            <w:pPr>
+              <w:pStyle w:val="Compact"/>
+            </w:pPr>
+            <w:r>
+              <w:t xml:space="preserve">The customer profile has not been created (event not consumed).</w:t>
+            </w:r>
+          </w:p>
+        </w:tc>
+        <w:tc>
+          <w:tcPr/>
+          <w:p>
+            <w:pPr>
+              <w:pStyle w:val="Compact"/>
+            </w:pPr>
+            <w:r>
+              <w:t xml:space="preserve">Wait and retry; with MESSAGING_ENABLED=true check the customer-service queue.</w:t>
+            </w:r>
+          </w:p>
+        </w:tc>
+      </w:tr>
+      <w:tr>
+        <w:tc>
+          <w:tcPr/>
+          <w:p>
+            <w:pPr>
+              <w:pStyle w:val="Compact"/>
+            </w:pPr>
+            <w:r>
+              <w:t xml:space="preserve">Emails do not arrive in Mailpit</w:t>
+            </w:r>
+          </w:p>
+        </w:tc>
+        <w:tc>
+          <w:tcPr/>
+          <w:p>
+            <w:pPr>
+              <w:pStyle w:val="Compact"/>
+            </w:pPr>
+            <w:r>
+              <w:t xml:space="preserve">MAIL_ENABLED=false or wrong host or port.</w:t>
+            </w:r>
+          </w:p>
+        </w:tc>
+        <w:tc>
+          <w:tcPr/>
+          <w:p>
+            <w:pPr>
+              <w:pStyle w:val="Compact"/>
+            </w:pPr>
+            <w:r>
+              <w:t xml:space="preserve">MAIL_HOST=localhost and MAIL_PORT=1025 on the host; MAIL_DOCKER_HOST=mailpit in Docker.</w:t>
+            </w:r>
+          </w:p>
+        </w:tc>
+      </w:tr>
+      <w:tr>
+        <w:tc>
+          <w:tcPr/>
+          <w:p>
+            <w:pPr>
+              <w:pStyle w:val="Compact"/>
+            </w:pPr>
+            <w:r>
               <w:t xml:space="preserve">Booking emails and reminders do not arrive</w:t>
             </w:r>
           </w:p>
@@ -16593,6 +17343,67 @@
             </w:pPr>
             <w:r>
               <w:t xml:space="preserve">Generate the key and restart security-service and notification-service.</w:t>
+            </w:r>
+          </w:p>
+        </w:tc>
+      </w:tr>
+      <w:tr>
+        <w:tc>
+          <w:tcPr/>
+          <w:p>
+            <w:pPr>
+              <w:pStyle w:val="Compact"/>
+            </w:pPr>
+            <w:r>
+              <w:t xml:space="preserve">Bookings that ended do not appear in "To close", or those without an operator do not become No-show</w:t>
+            </w:r>
+          </w:p>
+        </w:tc>
+        <w:tc>
+          <w:tcPr/>
+          <w:p>
+            <w:pPr>
+              <w:pStyle w:val="Compact"/>
+            </w:pPr>
+            <w:r>
+              <w:t xml:space="preserve">FOLLOW_UP_ENABLED=false, INTERNAL_API_KEY empty, or booking-service down.</w:t>
+            </w:r>
+          </w:p>
+        </w:tc>
+        <w:tc>
+          <w:tcPr/>
+          <w:p>
+            <w:pPr>
+              <w:pStyle w:val="Compact"/>
+            </w:pPr>
+            <w:r>
+              <w:t xml:space="preserve">Check the operations-service log (</w:t>
+            </w:r>
+            <w:r>
+              <w:rPr>
+                <w:i/>
+                <w:iCs/>
+              </w:rPr>
+              <w:t xml:space="preserve">Could not follow up finished bookings</w:t>
+            </w:r>
+            <w:r>
+              <w:t xml:space="preserve"> </w:t>
+            </w:r>
+            <w:r>
+              <w:t xml:space="preserve">or</w:t>
+            </w:r>
+            <w:r>
+              <w:t xml:space="preserve"> </w:t>
+            </w:r>
+            <w:r>
+              <w:rPr>
+                <w:i/>
+                <w:iCs/>
+              </w:rPr>
+              <w:t xml:space="preserve">was not closed as not attended</w:t>
+            </w:r>
+            <w:r>
+              <w:t xml:space="preserve">) and the internal key.</w:t>
             </w:r>
           </w:p>
         </w:tc>
@@ -16993,7 +17804,7 @@
               <w:pStyle w:val="Compact"/>
             </w:pPr>
             <w:r>
-              <w:t xml:space="preserve">Single entry point that routes the requests to the services; it does not validate tokens.</w:t>
+              <w:t xml:space="preserve">Single entry point that routes the requests to the services; it does not check the token signature, but since October 21, 2026 it cuts the tokens of closed sessions.</w:t>
             </w:r>
           </w:p>
         </w:tc>
@@ -17759,6 +18570,109 @@
             </w:pPr>
             <w:r>
               <w:t xml:space="preserve">11.4</w:t>
+            </w:r>
+          </w:p>
+        </w:tc>
+      </w:tr>
+      <w:tr>
+        <w:tc>
+          <w:tcPr/>
+          <w:p>
+            <w:pPr>
+              <w:pStyle w:val="Compact"/>
+            </w:pPr>
+            <w:r>
+              <w:t xml:space="preserve">Variables of October 21, 2026</w:t>
+            </w:r>
+          </w:p>
+        </w:tc>
+        <w:tc>
+          <w:tcPr/>
+          <w:p>
+            <w:pPr>
+              <w:pStyle w:val="Compact"/>
+            </w:pPr>
+            <w:r>
+              <w:rPr>
+                <w:i/>
+                <w:iCs/>
+              </w:rPr>
+              <w:t xml:space="preserve">SESSION_CHECK_*</w:t>
+            </w:r>
+            <w:r>
+              <w:t xml:space="preserve">,</w:t>
+            </w:r>
+            <w:r>
+              <w:t xml:space="preserve"> </w:t>
+            </w:r>
+            <w:r>
+              <w:rPr>
+                <w:i/>
+                <w:iCs/>
+              </w:rPr>
+              <w:t xml:space="preserve">BOOKING_EXPIRY_*</w:t>
+            </w:r>
+            <w:r>
+              <w:t xml:space="preserve">, and</w:t>
+            </w:r>
+            <w:r>
+              <w:t xml:space="preserve"> </w:t>
+            </w:r>
+            <w:r>
+              <w:rPr>
+                <w:i/>
+                <w:iCs/>
+              </w:rPr>
+              <w:t xml:space="preserve">FOLLOW_UP_*</w:t>
+            </w:r>
+            <w:r>
+              <w:t xml:space="preserve"> </w:t>
+            </w:r>
+            <w:r>
+              <w:t xml:space="preserve">are not in</w:t>
+            </w:r>
+            <w:r>
+              <w:t xml:space="preserve"> </w:t>
+            </w:r>
+            <w:r>
+              <w:rPr>
+                <w:i/>
+                <w:iCs/>
+              </w:rPr>
+              <w:t xml:space="preserve">.env.example</w:t>
+            </w:r>
+            <w:r>
+              <w:t xml:space="preserve"> </w:t>
+            </w:r>
+            <w:r>
+              <w:t xml:space="preserve">or in</w:t>
+            </w:r>
+            <w:r>
+              <w:t xml:space="preserve"> </w:t>
+            </w:r>
+            <w:r>
+              <w:rPr>
+                <w:i/>
+                <w:iCs/>
+              </w:rPr>
+              <w:t xml:space="preserve">docker-compose.yml</w:t>
+            </w:r>
+            <w:r>
+              <w:t xml:space="preserve"> </w:t>
+            </w:r>
+            <w:r>
+              <w:t xml:space="preserve">(action ACO-14).</w:t>
+            </w:r>
+          </w:p>
+        </w:tc>
+        <w:tc>
+          <w:tcPr/>
+          <w:p>
+            <w:pPr>
+              <w:pStyle w:val="Compact"/>
+            </w:pPr>
+            <w:r>
+              <w:t xml:space="preserve">10.2</w:t>
             </w:r>
           </w:p>
         </w:tc>

</xml_diff>

<commit_message>
docs(installation-manual): regenerate the PDF and Word
</commit_message>
<xml_diff>
--- a/09_MANUALES/EN/WORD/09_Installation_Manual.docx
+++ b/09_MANUALES/EN/WORD/09_Installation_Manual.docx
@@ -64,7 +64,7 @@
         <w:pStyle w:val="BodyText"/>
       </w:pPr>
       <w:r>
-        <w:t xml:space="preserve">October 26, 2026</w:t>
+        <w:t xml:space="preserve">October 27, 2026</w:t>
       </w:r>
     </w:p>
     <w:p>
@@ -72,7 +72,7 @@
         <w:pStyle w:val="BodyText"/>
       </w:pPr>
       <w:r>
-        <w:t xml:space="preserve">Manual Type: Installation Manual (Infrastructure and DevOps Staff) · Version 4.9</w:t>
+        <w:t xml:space="preserve">Manual Type: Installation Manual (Infrastructure and DevOps Staff) · Version 4.10</w:t>
       </w:r>
     </w:p>
     <w:bookmarkStart w:id="9" w:name="version-control"/>
@@ -1378,6 +1378,100 @@
             </w:r>
             <w:r>
               <w:t xml:space="preserve">(web, mobile app, payment-service, and infra) of October 26, 2026, and recommended tag for an evaluation installation (8.1).</w:t>
+            </w:r>
+          </w:p>
+        </w:tc>
+        <w:tc>
+          <w:tcPr/>
+          <w:p>
+            <w:pPr>
+              <w:pStyle w:val="Compact"/>
+            </w:pPr>
+            <w:r>
+              <w:t xml:space="preserve">Development team</w:t>
+            </w:r>
+          </w:p>
+        </w:tc>
+      </w:tr>
+      <w:tr>
+        <w:tc>
+          <w:tcPr/>
+          <w:p>
+            <w:pPr>
+              <w:pStyle w:val="Compact"/>
+            </w:pPr>
+            <w:r>
+              <w:t xml:space="preserve">4.10</w:t>
+            </w:r>
+          </w:p>
+        </w:tc>
+        <w:tc>
+          <w:tcPr/>
+          <w:p>
+            <w:pPr>
+              <w:pStyle w:val="Compact"/>
+            </w:pPr>
+            <w:r>
+              <w:t xml:space="preserve">2026-10-27</w:t>
+            </w:r>
+          </w:p>
+        </w:tc>
+        <w:tc>
+          <w:tcPr/>
+          <w:p>
+            <w:pPr>
+              <w:pStyle w:val="Compact"/>
+            </w:pPr>
+            <w:r>
+              <w:t xml:space="preserve">Versions</w:t>
+            </w:r>
+            <w:r>
+              <w:t xml:space="preserve"> </w:t>
+            </w:r>
+            <w:r>
+              <w:rPr>
+                <w:i/>
+                <w:iCs/>
+              </w:rPr>
+              <w:t xml:space="preserve">v1.1.1</w:t>
+            </w:r>
+            <w:r>
+              <w:t xml:space="preserve"> </w:t>
+            </w:r>
+            <w:r>
+              <w:t xml:space="preserve">(customer and booking) and</w:t>
+            </w:r>
+            <w:r>
+              <w:t xml:space="preserve"> </w:t>
+            </w:r>
+            <w:r>
+              <w:rPr>
+                <w:i/>
+                <w:iCs/>
+              </w:rPr>
+              <w:t xml:space="preserve">v1.1.2</w:t>
+            </w:r>
+            <w:r>
+              <w:t xml:space="preserve"> </w:t>
+            </w:r>
+            <w:r>
+              <w:t xml:space="preserve">(web, mobile app, payment-service, and infra) of October 27, 2026 and tags to use (8.1); 58 tables (11.1, 11.5, and checklist);</w:t>
+            </w:r>
+            <w:r>
+              <w:t xml:space="preserve"> </w:t>
+            </w:r>
+            <w:r>
+              <w:rPr>
+                <w:i/>
+                <w:iCs/>
+              </w:rPr>
+              <w:t xml:space="preserve">operations-service.booking-confirmed</w:t>
+            </w:r>
+            <w:r>
+              <w:t xml:space="preserve"> </w:t>
+            </w:r>
+            <w:r>
+              <w:t xml:space="preserve">queue in the RabbitMQ topology (12.5).</w:t>
             </w:r>
           </w:p>
         </w:tc>
@@ -5674,7 +5768,10 @@
         <w:t xml:space="preserve"> </w:t>
       </w:r>
       <w:r>
-        <w:t xml:space="preserve">in the web, the mobile app, payment-service, and infra. For an evaluation installation, use the most recent tag of each repository (</w:t>
+        <w:t xml:space="preserve">in the web, the mobile app, payment-service, and infra. On October 27, 2026</w:t>
+      </w:r>
+      <w:r>
+        <w:t xml:space="preserve"> </w:t>
       </w:r>
       <w:r>
         <w:rPr>
@@ -5687,7 +5784,55 @@
         <w:t xml:space="preserve"> </w:t>
       </w:r>
       <w:r>
-        <w:t xml:space="preserve">where it exists and</w:t>
+        <w:t xml:space="preserve">shipped in customer-service and booking-service and</w:t>
+      </w:r>
+      <w:r>
+        <w:t xml:space="preserve"> </w:t>
+      </w:r>
+      <w:r>
+        <w:rPr>
+          <w:i/>
+          <w:iCs/>
+        </w:rPr>
+        <w:t xml:space="preserve">v1.1.2</w:t>
+      </w:r>
+      <w:r>
+        <w:t xml:space="preserve"> </w:t>
+      </w:r>
+      <w:r>
+        <w:t xml:space="preserve">in the web, the mobile app, payment-service, and infra. For an evaluation installation, use the most recent tag of each repository:</w:t>
+      </w:r>
+      <w:r>
+        <w:t xml:space="preserve"> </w:t>
+      </w:r>
+      <w:r>
+        <w:rPr>
+          <w:i/>
+          <w:iCs/>
+        </w:rPr>
+        <w:t xml:space="preserve">v1.1.2</w:t>
+      </w:r>
+      <w:r>
+        <w:t xml:space="preserve"> </w:t>
+      </w:r>
+      <w:r>
+        <w:t xml:space="preserve">in the web, the mobile app, payment-service, and infra;</w:t>
+      </w:r>
+      <w:r>
+        <w:t xml:space="preserve"> </w:t>
+      </w:r>
+      <w:r>
+        <w:rPr>
+          <w:i/>
+          <w:iCs/>
+        </w:rPr>
+        <w:t xml:space="preserve">v1.1.1</w:t>
+      </w:r>
+      <w:r>
+        <w:t xml:space="preserve"> </w:t>
+      </w:r>
+      <w:r>
+        <w:t xml:space="preserve">in customer-service and booking-service; and</w:t>
       </w:r>
       <w:r>
         <w:t xml:space="preserve"> </w:t>
@@ -5703,7 +5848,20 @@
         <w:t xml:space="preserve"> </w:t>
       </w:r>
       <w:r>
-        <w:t xml:space="preserve">in the others), or</w:t>
+        <w:t xml:space="preserve">in the API Gateway, security-service, operations-service, and notification-service. Each one is the tip of</w:t>
+      </w:r>
+      <w:r>
+        <w:t xml:space="preserve"> </w:t>
+      </w:r>
+      <w:r>
+        <w:rPr>
+          <w:i/>
+          <w:iCs/>
+        </w:rPr>
+        <w:t xml:space="preserve">main</w:t>
+      </w:r>
+      <w:r>
+        <w:t xml:space="preserve">, which is protected in the 10 repositories and is what the public server runs;</w:t>
       </w:r>
       <w:r>
         <w:t xml:space="preserve"> </w:t>
@@ -5719,7 +5877,7 @@
         <w:t xml:space="preserve"> </w:t>
       </w:r>
       <w:r>
-        <w:t xml:space="preserve">in all of them to see the latest.</w:t>
+        <w:t xml:space="preserve">has the latest work not yet released in a version.</w:t>
       </w:r>
     </w:p>
     <w:p>
@@ -10495,7 +10653,7 @@
         <w:t xml:space="preserve"> </w:t>
       </w:r>
       <w:r>
-        <w:t xml:space="preserve">(57 tables). Each service owns its schemas and migrates only them with Liquibase, with its own control tables</w:t>
+        <w:t xml:space="preserve">(58 tables). Each service owns its schemas and migrates only them with Liquibase, with its own control tables</w:t>
       </w:r>
       <w:r>
         <w:t xml:space="preserve"> </w:t>
@@ -12343,7 +12501,7 @@
         <w:rPr>
           <w:rStyle w:val="CommentTok"/>
         </w:rPr>
-        <w:t xml:space="preserve">-- 1) Tables per schema (57 in total when all the services have started)</w:t>
+        <w:t xml:space="preserve">-- 1) Tables per schema (58 in total when all the services have started)</w:t>
       </w:r>
       <w:r>
         <w:br/>
@@ -14588,10 +14746,7 @@
         <w:t xml:space="preserve">customer-service.events</w:t>
       </w:r>
       <w:r>
-        <w:t xml:space="preserve"> </w:t>
-      </w:r>
-      <w:r>
-        <w:t xml:space="preserve">and</w:t>
+        <w:t xml:space="preserve">,</w:t>
       </w:r>
       <w:r>
         <w:t xml:space="preserve"> </w:t>
@@ -14604,7 +14759,49 @@
         <w:t xml:space="preserve">notification-service.events</w:t>
       </w:r>
       <w:r>
-        <w:t xml:space="preserve">; and their dead-letter queues (</w:t>
+        <w:t xml:space="preserve">, and</w:t>
+      </w:r>
+      <w:r>
+        <w:t xml:space="preserve"> </w:t>
+      </w:r>
+      <w:r>
+        <w:rPr>
+          <w:i/>
+          <w:iCs/>
+        </w:rPr>
+        <w:t xml:space="preserve">operations-service.booking-confirmed</w:t>
+      </w:r>
+      <w:r>
+        <w:t xml:space="preserve"> </w:t>
+      </w:r>
+      <w:r>
+        <w:t xml:space="preserve">(only</w:t>
+      </w:r>
+      <w:r>
+        <w:t xml:space="preserve"> </w:t>
+      </w:r>
+      <w:r>
+        <w:rPr>
+          <w:i/>
+          <w:iCs/>
+        </w:rPr>
+        <w:t xml:space="preserve">booking.confirmed</w:t>
+      </w:r>
+      <w:r>
+        <w:t xml:space="preserve">; it replaced the old</w:t>
+      </w:r>
+      <w:r>
+        <w:t xml:space="preserve"> </w:t>
+      </w:r>
+      <w:r>
+        <w:rPr>
+          <w:i/>
+          <w:iCs/>
+        </w:rPr>
+        <w:t xml:space="preserve">operations-service.events</w:t>
+      </w:r>
+      <w:r>
+        <w:t xml:space="preserve">, which operations-service empties and deletes at start-up); and their dead-letter queues (</w:t>
       </w:r>
       <w:r>
         <w:rPr>
@@ -14614,7 +14811,23 @@
         <w:t xml:space="preserve">.dlq</w:t>
       </w:r>
       <w:r>
-        <w:t xml:space="preserve">), to which a message moves after three failed retries. Since October 26, 2026 booking-service also consumes: it creates the</w:t>
+        <w:t xml:space="preserve">, through the</w:t>
+      </w:r>
+      <w:r>
+        <w:t xml:space="preserve"> </w:t>
+      </w:r>
+      <w:r>
+        <w:rPr>
+          <w:i/>
+          <w:iCs/>
+        </w:rPr>
+        <w:t xml:space="preserve">carwash.events.dlx</w:t>
+      </w:r>
+      <w:r>
+        <w:t xml:space="preserve"> </w:t>
+      </w:r>
+      <w:r>
+        <w:t xml:space="preserve">exchange), to which a message moves after three failed retries. Since October 26, 2026 booking-service also consumes: it creates the</w:t>
       </w:r>
       <w:r>
         <w:t xml:space="preserve"> </w:t>
@@ -17075,7 +17288,7 @@
               <w:pStyle w:val="Compact"/>
             </w:pPr>
             <w:r>
-              <w:t xml:space="preserve">The 57 tables in the nine schemas (section 11.5).</w:t>
+              <w:t xml:space="preserve">The 58 tables in the nine schemas (section 11.5).</w:t>
             </w:r>
           </w:p>
         </w:tc>

</xml_diff>